<commit_message>
Update all deliverables: Rivet with pre-calculated JSON, monthly reports, KNOWLEDGE.md
- Rivet: Add positions with monthly_change_pct from CSV, fix Compliance Reviewer connections
- Letter Writer: Include monthly stock returns from profitability CSV in letter
- KNOWLEDGE.md: Add sections on Rivet architecture and Flask API
- Regenerate monthly_report_albert.docx with stock monthly returns
- Regenerate workflow_report.docx with updated improvement report

Co-Authored-By: Claude Opus 4.6 <noreply@anthropic.com>
</commit_message>
<xml_diff>
--- a/output/monthly_report_albert.docx
+++ b/output/monthly_report_albert.docx
@@ -103,17 +103,6 @@
       <w:r>
         <w:rPr>
           <w:rFonts w:ascii="Calibri" w:hAnsi="Calibri"/>
-          <w:color w:val="333333"/>
-          <w:sz w:val="21"/>
-        </w:rPr>
-        <w:t>No cenário internacional, a política tarifária dos EUA continuou gerando incerteza, enquanto o Federal Reserve manteve os juros estáveis diante de uma inflação persistente.</w:t>
-      </w:r>
-    </w:p>
-    <w:p/>
-    <w:p>
-      <w:r>
-        <w:rPr>
-          <w:rFonts w:ascii="Calibri" w:hAnsi="Calibri"/>
           <w:b/>
           <w:color w:val="1A1A2E"/>
           <w:sz w:val="22"/>
@@ -140,7 +129,48 @@
           <w:color w:val="333333"/>
           <w:sz w:val="21"/>
         </w:rPr>
-        <w:t>O portfólio mantém uma alocação diversificada e alinhada ao seu perfil Moderado, com exposição equilibrada entre as diferentes classes de ativos. A parcela de renda fixa continua se beneficiando do ambiente de juros elevados, enquanto a exposição a renda variável foi impactada pela volatilidade do período.</w:t>
+        <w:t>Rentabilidade Mensal das Ações (calculada automaticamente a partir do CSV):</w:t>
+      </w:r>
+    </w:p>
+    <w:p/>
+    <w:p>
+      <w:r>
+        <w:rPr>
+          <w:rFonts w:ascii="Calibri" w:hAnsi="Calibri"/>
+          <w:color w:val="333333"/>
+          <w:sz w:val="21"/>
+        </w:rPr>
+        <w:t>- LREN3 (Lojas Renner): valorização de 8.9% no mês</w:t>
+      </w:r>
+    </w:p>
+    <w:p>
+      <w:r>
+        <w:rPr>
+          <w:rFonts w:ascii="Calibri" w:hAnsi="Calibri"/>
+          <w:color w:val="333333"/>
+          <w:sz w:val="21"/>
+        </w:rPr>
+        <w:t>- MRFG3 (Marfrig): desvalorização de 16.4% no mês</w:t>
+      </w:r>
+    </w:p>
+    <w:p>
+      <w:r>
+        <w:rPr>
+          <w:rFonts w:ascii="Calibri" w:hAnsi="Calibri"/>
+          <w:color w:val="333333"/>
+          <w:sz w:val="21"/>
+        </w:rPr>
+        <w:t>- ARZZ3 (Arezzo): valorização de 0.1% no mês</w:t>
+      </w:r>
+    </w:p>
+    <w:p>
+      <w:r>
+        <w:rPr>
+          <w:rFonts w:ascii="Calibri" w:hAnsi="Calibri"/>
+          <w:color w:val="333333"/>
+          <w:sz w:val="21"/>
+        </w:rPr>
+        <w:t>- HAPV3 (Hapvida): valorização de 76.4% no mês</w:t>
       </w:r>
     </w:p>
     <w:p/>
@@ -152,7 +182,7 @@
           <w:color w:val="1A1A2E"/>
           <w:sz w:val="22"/>
         </w:rPr>
-        <w:t>Posicionamento e Perspectivas</w:t>
+        <w:t>Posicionamento e Recomendações</w:t>
       </w:r>
     </w:p>
     <w:p/>
@@ -196,84 +226,7 @@
           <w:color w:val="333333"/>
           <w:sz w:val="21"/>
         </w:rPr>
-        <w:t>A posição em Hapvida (HAPV3) apresenta uma desvalorização de -74.6% em relação ao preço médio. É recomendável uma revisão desta posição à luz da tese original de investimento.</w:t>
-      </w:r>
-    </w:p>
-    <w:p/>
-    <w:p>
-      <w:r>
-        <w:rPr>
-          <w:rFonts w:ascii="Calibri" w:hAnsi="Calibri"/>
-          <w:color w:val="333333"/>
-          <w:sz w:val="21"/>
-        </w:rPr>
-        <w:t>A posição em Lojas Renner (LREN3) apresenta uma desvalorização de -41.7% em relação ao preço médio. É recomendável uma revisão desta posição à luz da tese original de investimento.</w:t>
-      </w:r>
-    </w:p>
-    <w:p/>
-    <w:p>
-      <w:r>
-        <w:rPr>
-          <w:rFonts w:ascii="Calibri" w:hAnsi="Calibri"/>
-          <w:color w:val="333333"/>
-          <w:sz w:val="21"/>
-        </w:rPr>
-        <w:t>A posição em Arezzo (ARZZ3) apresenta uma desvalorização de -31.1% em relação ao preço médio. É recomendável uma revisão desta posição à luz da tese original de investimento.</w:t>
-      </w:r>
-    </w:p>
-    <w:p/>
-    <w:p>
-      <w:r>
-        <w:rPr>
-          <w:rFonts w:ascii="Calibri" w:hAnsi="Calibri"/>
-          <w:color w:val="333333"/>
-          <w:sz w:val="21"/>
-        </w:rPr>
-        <w:t>A posição em Constellation Institucional Advisory FIC FIA (CONST-FIA) apresenta uma desvalorização de -25.7% em relação ao preço médio. É recomendável uma revisão desta posição à luz da tese original de investimento.</w:t>
-      </w:r>
-    </w:p>
-    <w:p/>
-    <w:p>
-      <w:r>
-        <w:rPr>
-          <w:rFonts w:ascii="Calibri" w:hAnsi="Calibri"/>
-          <w:color w:val="333333"/>
-          <w:sz w:val="21"/>
-        </w:rPr>
-        <w:t>A posição em Marfrig (MRFG3) acumula valorização de 43.5%. Pode ser oportuno considerar uma realização parcial de lucros para reequilibrar o portfólio.</w:t>
-      </w:r>
-    </w:p>
-    <w:p/>
-    <w:p>
-      <w:r>
-        <w:rPr>
-          <w:rFonts w:ascii="Calibri" w:hAnsi="Calibri"/>
-          <w:color w:val="333333"/>
-          <w:sz w:val="21"/>
-        </w:rPr>
-        <w:t>A posição em CDB Banco C6 Consignado SET/2024 (CDB-C6) acumula valorização de 34.9%. Pode ser oportuno considerar uma realização parcial de lucros para reequilibrar o portfólio.</w:t>
-      </w:r>
-    </w:p>
-    <w:p/>
-    <w:p>
-      <w:r>
-        <w:rPr>
-          <w:rFonts w:ascii="Calibri" w:hAnsi="Calibri"/>
-          <w:color w:val="333333"/>
-          <w:sz w:val="21"/>
-        </w:rPr>
-        <w:t>A posição em Ibiuna Hedge ST Advisory FIC FIM (IBIUNA-HST) acumula valorização de 33.7%. Pode ser oportuno considerar uma realização parcial de lucros para reequilibrar o portfólio.</w:t>
-      </w:r>
-    </w:p>
-    <w:p/>
-    <w:p>
-      <w:r>
-        <w:rPr>
-          <w:rFonts w:ascii="Calibri" w:hAnsi="Calibri"/>
-          <w:color w:val="333333"/>
-          <w:sz w:val="21"/>
-        </w:rPr>
-        <w:t>Diante do cenário atual, entendemos que a carteira está adequadamente posicionada para navegar o ambiente de juros elevados e desaceleração econômica. Seguimos atentos às oportunidades que possam surgir com a evolução do cenário.</w:t>
+        <w:t>Diante do cenário atual, seguimos atentos às oportunidades que possam surgir com a evolução do cenário.</w:t>
       </w:r>
     </w:p>
     <w:p/>

</xml_diff>

<commit_message>
Fix monthly report to fit 1-2 pages: tighten spacing, remove blank paragraphs
- doc_formatter.py: set tight paragraph spacing (space_before/after), single
  line spacing on bullets, compact header, smaller margins (2.0cm), smaller
  fonts for bullets (9pt) and disclaimer (7.5pt)
- letter_writer.py: remove excessive blank lines from fallback template so
  doc_formatter no longer creates empty paragraphs
- Regenerated monthly_report_albert.docx — now fits ~1 page vs. 3 before

Co-Authored-By: Claude Opus 4.6 <noreply@anthropic.com>
</commit_message>
<xml_diff>
--- a/output/monthly_report_albert.docx
+++ b/output/monthly_report_albert.docx
@@ -4,43 +4,7 @@
   <w:body>
     <w:p>
       <w:pPr>
-        <w:jc w:val="left"/>
-      </w:pPr>
-      <w:r>
-        <w:rPr>
-          <w:b/>
-          <w:color w:val="1A1A2E"/>
-          <w:sz w:val="36"/>
-        </w:rPr>
-        <w:t>XP Investimentos</w:t>
-      </w:r>
-    </w:p>
-    <w:p>
-      <w:pPr>
-        <w:jc w:val="left"/>
-      </w:pPr>
-      <w:r>
-        <w:rPr>
-          <w:color w:val="6B7B8F"/>
-          <w:sz w:val="20"/>
-        </w:rPr>
-        <w:t>Assessoria de Investimentos</w:t>
-      </w:r>
-    </w:p>
-    <w:p>
-      <w:pPr>
-        <w:jc w:val="left"/>
-      </w:pPr>
-      <w:r>
-        <w:rPr>
-          <w:color w:val="EDB92E"/>
-          <w:sz w:val="12"/>
-        </w:rPr>
-        <w:t>________________________________________________________________________________</w:t>
-      </w:r>
-    </w:p>
-    <w:p>
-      <w:pPr>
+        <w:spacing w:after="0"/>
         <w:jc w:val="left"/>
       </w:pPr>
       <w:r>
@@ -48,275 +12,377 @@
           <w:rFonts w:ascii="Calibri" w:hAnsi="Calibri"/>
           <w:b/>
           <w:color w:val="1A1A2E"/>
-          <w:sz w:val="28"/>
+          <w:sz w:val="32"/>
         </w:rPr>
-        <w:t>Carta Mensal de Investimentos — Fevereiro/2026</w:t>
+        <w:t>XP Investimentos</w:t>
       </w:r>
-    </w:p>
-    <w:p/>
-    <w:p>
+      <w:r>
+        <w:rPr>
+          <w:sz w:val="12"/>
+        </w:rPr>
+        <w:br/>
+      </w:r>
       <w:r>
         <w:rPr>
           <w:rFonts w:ascii="Calibri" w:hAnsi="Calibri"/>
-          <w:color w:val="333333"/>
-          <w:sz w:val="21"/>
+          <w:color w:val="6B7B8F"/>
+          <w:sz w:val="18"/>
         </w:rPr>
-        <w:t>Prezado(a) Albert da Silva,</w:t>
+        <w:t>Assessoria de Investimentos</w:t>
       </w:r>
     </w:p>
-    <w:p/>
     <w:p>
+      <w:pPr>
+        <w:spacing w:before="40" w:after="120"/>
+      </w:pPr>
       <w:r>
         <w:rPr>
           <w:rFonts w:ascii="Calibri" w:hAnsi="Calibri"/>
-          <w:color w:val="333333"/>
-          <w:sz w:val="21"/>
+          <w:color w:val="EDB92E"/>
+          <w:sz w:val="10"/>
         </w:rPr>
-        <w:t>Espero que esteja bem. Apresento a seguir o relatório mensal de sua carteira de investimentos, referente ao mês de fevereiro de 2026.</w:t>
+        <w:t>__________________________________________________________________________________________</w:t>
       </w:r>
     </w:p>
-    <w:p/>
     <w:p>
+      <w:pPr>
+        <w:spacing w:line="276" w:lineRule="auto" w:before="0" w:after="120"/>
+        <w:jc w:val="left"/>
+      </w:pPr>
       <w:r>
         <w:rPr>
           <w:rFonts w:ascii="Calibri" w:hAnsi="Calibri"/>
           <w:b/>
           <w:color w:val="1A1A2E"/>
-          <w:sz w:val="22"/>
+          <w:sz w:val="24"/>
         </w:rPr>
-        <w:t>Cenário Macroeconômico</w:t>
+        <w:t>Carta Mensal de Investimentos — Fevereiro/2026</w:t>
       </w:r>
     </w:p>
-    <w:p/>
     <w:p>
+      <w:pPr>
+        <w:spacing w:line="276" w:lineRule="auto" w:before="80" w:after="80"/>
+      </w:pPr>
       <w:r>
         <w:rPr>
           <w:rFonts w:ascii="Calibri" w:hAnsi="Calibri"/>
           <w:color w:val="333333"/>
-          <w:sz w:val="21"/>
+          <w:sz w:val="20"/>
         </w:rPr>
-        <w:t>O mês de fevereiro foi marcado por um cenário de cautela nos mercados. O Comitê de Política Monetária (Copom) elevou a taxa Selic para 14.25% ao ano, reforçando o compromisso com o controle da inflação, que acumula 5.2% em 12 meses. A economia brasileira mostra sinais de desaceleração, com projeção de crescimento de 2.0% para 2025, ante 3.6% registrado em 2024. O câmbio operou com volatilidade, com o dólar cotado a R$5.85.</w:t>
+        <w:t>Prezado(a) Albert da Silva,</w:t>
       </w:r>
     </w:p>
-    <w:p/>
     <w:p>
+      <w:pPr>
+        <w:spacing w:line="276" w:lineRule="auto" w:before="40" w:after="40"/>
+      </w:pPr>
+      <w:r>
+        <w:rPr>
+          <w:rFonts w:ascii="Calibri" w:hAnsi="Calibri"/>
+          <w:color w:val="333333"/>
+          <w:sz w:val="20"/>
+        </w:rPr>
+        <w:t>Espero que esteja bem. Apresento a seguir o relatório mensal de sua carteira de investimentos, referente ao mês de fevereiro de 2026.</w:t>
+      </w:r>
+    </w:p>
+    <w:p>
+      <w:pPr>
+        <w:spacing w:line="276" w:lineRule="auto" w:before="160" w:after="40"/>
+      </w:pPr>
       <w:r>
         <w:rPr>
           <w:rFonts w:ascii="Calibri" w:hAnsi="Calibri"/>
           <w:b/>
           <w:color w:val="1A1A2E"/>
-          <w:sz w:val="22"/>
+          <w:sz w:val="21"/>
+        </w:rPr>
+        <w:t>Cenário Macroeconômico</w:t>
+      </w:r>
+    </w:p>
+    <w:p>
+      <w:pPr>
+        <w:spacing w:line="276" w:lineRule="auto" w:before="40" w:after="40"/>
+      </w:pPr>
+      <w:r>
+        <w:rPr>
+          <w:rFonts w:ascii="Calibri" w:hAnsi="Calibri"/>
+          <w:color w:val="333333"/>
+          <w:sz w:val="20"/>
+        </w:rPr>
+        <w:t>O mês de fevereiro foi marcado por um cenário de cautela nos mercados. O Comitê de Política Monetária (Copom) elevou a taxa Selic para 14.25% ao ano, reforçando o compromisso com o controle da inflação, que acumula 5.2% em 12 meses. A economia brasileira mostra sinais de desaceleração, com projeção de crescimento de 2.0% para 2025, ante 3.6% registrado em 2024. O câmbio operou com volatilidade, com o dólar cotado a R$5.85.</w:t>
+      </w:r>
+    </w:p>
+    <w:p>
+      <w:pPr>
+        <w:spacing w:line="276" w:lineRule="auto" w:before="160" w:after="40"/>
+      </w:pPr>
+      <w:r>
+        <w:rPr>
+          <w:rFonts w:ascii="Calibri" w:hAnsi="Calibri"/>
+          <w:b/>
+          <w:color w:val="1A1A2E"/>
+          <w:sz w:val="21"/>
         </w:rPr>
         <w:t>Desempenho da Carteira</w:t>
       </w:r>
     </w:p>
-    <w:p/>
     <w:p>
+      <w:pPr>
+        <w:spacing w:line="276" w:lineRule="auto" w:before="40" w:after="40"/>
+      </w:pPr>
       <w:r>
         <w:rPr>
           <w:rFonts w:ascii="Calibri" w:hAnsi="Calibri"/>
           <w:color w:val="333333"/>
-          <w:sz w:val="21"/>
+          <w:sz w:val="20"/>
         </w:rPr>
         <w:t>Sua carteira apresentou rentabilidade de -2.35% no mês, ficando abaixo do o CDI de 1.07% em 3.42 pontos percentuais. No acumulado do ano, o retorno é de -5.10%, e nos últimos 12 meses, de -8.40%.</w:t>
       </w:r>
     </w:p>
-    <w:p/>
     <w:p>
+      <w:pPr>
+        <w:spacing w:line="276" w:lineRule="auto" w:before="160" w:after="40"/>
+      </w:pPr>
       <w:r>
         <w:rPr>
           <w:rFonts w:ascii="Calibri" w:hAnsi="Calibri"/>
-          <w:color w:val="333333"/>
+          <w:b/>
+          <w:color w:val="1A1A2E"/>
           <w:sz w:val="21"/>
         </w:rPr>
         <w:t>Rentabilidade Mensal das Ações (calculada automaticamente a partir do CSV):</w:t>
       </w:r>
     </w:p>
-    <w:p/>
     <w:p>
+      <w:pPr>
+        <w:spacing w:line="240" w:lineRule="auto" w:before="0" w:after="20"/>
+        <w:ind w:left="283"/>
+      </w:pPr>
       <w:r>
         <w:rPr>
           <w:rFonts w:ascii="Calibri" w:hAnsi="Calibri"/>
           <w:color w:val="333333"/>
-          <w:sz w:val="21"/>
+          <w:sz w:val="18"/>
         </w:rPr>
         <w:t>- LREN3 (Lojas Renner): valorização de 8.9% no mês</w:t>
       </w:r>
     </w:p>
     <w:p>
+      <w:pPr>
+        <w:spacing w:line="240" w:lineRule="auto" w:before="0" w:after="20"/>
+        <w:ind w:left="283"/>
+      </w:pPr>
       <w:r>
         <w:rPr>
           <w:rFonts w:ascii="Calibri" w:hAnsi="Calibri"/>
           <w:color w:val="333333"/>
-          <w:sz w:val="21"/>
+          <w:sz w:val="18"/>
         </w:rPr>
         <w:t>- MRFG3 (Marfrig): desvalorização de 16.4% no mês</w:t>
       </w:r>
     </w:p>
     <w:p>
+      <w:pPr>
+        <w:spacing w:line="240" w:lineRule="auto" w:before="0" w:after="20"/>
+        <w:ind w:left="283"/>
+      </w:pPr>
       <w:r>
         <w:rPr>
           <w:rFonts w:ascii="Calibri" w:hAnsi="Calibri"/>
           <w:color w:val="333333"/>
-          <w:sz w:val="21"/>
+          <w:sz w:val="18"/>
         </w:rPr>
         <w:t>- ARZZ3 (Arezzo): valorização de 0.1% no mês</w:t>
       </w:r>
     </w:p>
     <w:p>
+      <w:pPr>
+        <w:spacing w:line="240" w:lineRule="auto" w:before="0" w:after="20"/>
+        <w:ind w:left="283"/>
+      </w:pPr>
       <w:r>
         <w:rPr>
           <w:rFonts w:ascii="Calibri" w:hAnsi="Calibri"/>
           <w:color w:val="333333"/>
-          <w:sz w:val="21"/>
+          <w:sz w:val="18"/>
         </w:rPr>
         <w:t>- HAPV3 (Hapvida): valorização de 76.4% no mês</w:t>
       </w:r>
     </w:p>
-    <w:p/>
     <w:p>
+      <w:pPr>
+        <w:spacing w:line="276" w:lineRule="auto" w:before="160" w:after="40"/>
+      </w:pPr>
       <w:r>
         <w:rPr>
           <w:rFonts w:ascii="Calibri" w:hAnsi="Calibri"/>
           <w:b/>
           <w:color w:val="1A1A2E"/>
-          <w:sz w:val="22"/>
+          <w:sz w:val="21"/>
         </w:rPr>
         <w:t>Posicionamento e Recomendações</w:t>
       </w:r>
     </w:p>
-    <w:p/>
     <w:p>
+      <w:pPr>
+        <w:spacing w:line="276" w:lineRule="auto" w:before="40" w:after="40"/>
+      </w:pPr>
       <w:r>
         <w:rPr>
           <w:rFonts w:ascii="Calibri" w:hAnsi="Calibri"/>
           <w:color w:val="333333"/>
-          <w:sz w:val="21"/>
+          <w:sz w:val="20"/>
         </w:rPr>
         <w:t>A alocação em Renda Fixa encontra-se acima do target para o perfil Moderado (70.8% vs. 45% alvo). Pode ser oportuno avaliar uma redução gradual de aproximadamente R$99,964 nesta classe.</w:t>
       </w:r>
     </w:p>
-    <w:p/>
     <w:p>
+      <w:pPr>
+        <w:spacing w:line="276" w:lineRule="auto" w:before="40" w:after="40"/>
+      </w:pPr>
       <w:r>
         <w:rPr>
           <w:rFonts w:ascii="Calibri" w:hAnsi="Calibri"/>
           <w:color w:val="333333"/>
-          <w:sz w:val="21"/>
+          <w:sz w:val="20"/>
         </w:rPr>
         <w:t>A alocação em FIIs está abaixo do nível sugerido para o perfil Moderado (0.0% vs. 15% alvo). Considerando o cenário atual, pode ser interessante avaliar um incremento de aproximadamente R$58,029.</w:t>
       </w:r>
     </w:p>
-    <w:p/>
     <w:p>
+      <w:pPr>
+        <w:spacing w:line="276" w:lineRule="auto" w:before="40" w:after="40"/>
+      </w:pPr>
       <w:r>
         <w:rPr>
           <w:rFonts w:ascii="Calibri" w:hAnsi="Calibri"/>
           <w:color w:val="333333"/>
-          <w:sz w:val="21"/>
+          <w:sz w:val="20"/>
         </w:rPr>
         <w:t>A alocação em Internacional está abaixo do nível sugerido para o perfil Moderado (0.0% vs. 12% alvo). Considerando o cenário atual, pode ser interessante avaliar um incremento de aproximadamente R$46,423.</w:t>
       </w:r>
     </w:p>
-    <w:p/>
     <w:p>
+      <w:pPr>
+        <w:spacing w:line="276" w:lineRule="auto" w:before="40" w:after="40"/>
+      </w:pPr>
       <w:r>
         <w:rPr>
           <w:rFonts w:ascii="Calibri" w:hAnsi="Calibri"/>
           <w:color w:val="333333"/>
-          <w:sz w:val="21"/>
+          <w:sz w:val="20"/>
         </w:rPr>
         <w:t>Diante do cenário atual, seguimos atentos às oportunidades que possam surgir com a evolução do cenário.</w:t>
       </w:r>
     </w:p>
-    <w:p/>
     <w:p>
+      <w:pPr>
+        <w:spacing w:line="276" w:lineRule="auto" w:before="40" w:after="40"/>
+      </w:pPr>
       <w:r>
         <w:rPr>
           <w:rFonts w:ascii="Calibri" w:hAnsi="Calibri"/>
           <w:color w:val="333333"/>
-          <w:sz w:val="21"/>
+          <w:sz w:val="20"/>
         </w:rPr>
         <w:t>Permaneço à disposição para agendarmos uma conversa e discutirmos em mais detalhes o posicionamento de sua carteira.</w:t>
       </w:r>
     </w:p>
-    <w:p/>
     <w:p>
+      <w:pPr>
+        <w:spacing w:line="276" w:lineRule="auto" w:before="120" w:after="40"/>
+      </w:pPr>
       <w:r>
         <w:rPr>
           <w:rFonts w:ascii="Calibri" w:hAnsi="Calibri"/>
           <w:color w:val="333333"/>
-          <w:sz w:val="21"/>
+          <w:sz w:val="20"/>
         </w:rPr>
         <w:t>Atenciosamente,</w:t>
       </w:r>
     </w:p>
-    <w:p/>
     <w:p>
+      <w:pPr>
+        <w:spacing w:line="276" w:lineRule="auto" w:before="40" w:after="40"/>
+      </w:pPr>
       <w:r>
         <w:rPr>
           <w:rFonts w:ascii="Calibri" w:hAnsi="Calibri"/>
           <w:color w:val="333333"/>
-          <w:sz w:val="21"/>
+          <w:sz w:val="20"/>
         </w:rPr>
         <w:t>Carlos Eduardo Martins</w:t>
       </w:r>
     </w:p>
     <w:p>
+      <w:pPr>
+        <w:spacing w:line="276" w:lineRule="auto" w:before="40" w:after="40"/>
+      </w:pPr>
       <w:r>
         <w:rPr>
           <w:rFonts w:ascii="Calibri" w:hAnsi="Calibri"/>
           <w:color w:val="333333"/>
-          <w:sz w:val="21"/>
+          <w:sz w:val="20"/>
         </w:rPr>
         <w:t>CNPI-T 12345</w:t>
       </w:r>
     </w:p>
     <w:p>
+      <w:pPr>
+        <w:spacing w:line="276" w:lineRule="auto" w:before="40" w:after="40"/>
+      </w:pPr>
       <w:r>
         <w:rPr>
           <w:rFonts w:ascii="Calibri" w:hAnsi="Calibri"/>
           <w:color w:val="333333"/>
-          <w:sz w:val="21"/>
+          <w:sz w:val="20"/>
         </w:rPr>
         <w:t>XP Investimentos - Faria Lima</w:t>
       </w:r>
     </w:p>
     <w:p>
+      <w:pPr>
+        <w:spacing w:line="276" w:lineRule="auto" w:before="40" w:after="40"/>
+      </w:pPr>
       <w:r>
         <w:rPr>
           <w:rFonts w:ascii="Calibri" w:hAnsi="Calibri"/>
           <w:color w:val="333333"/>
-          <w:sz w:val="21"/>
+          <w:sz w:val="20"/>
         </w:rPr>
         <w:t>(11) 91234-5678</w:t>
       </w:r>
     </w:p>
-    <w:p/>
     <w:p>
+      <w:pPr>
+        <w:spacing w:line="276" w:lineRule="auto" w:before="80" w:after="40"/>
+      </w:pPr>
       <w:r>
         <w:rPr>
           <w:rFonts w:ascii="Calibri" w:hAnsi="Calibri"/>
           <w:color w:val="CCCCCC"/>
-          <w:sz w:val="12"/>
+          <w:sz w:val="10"/>
         </w:rPr>
-        <w:t>________________________________________________________________________________</w:t>
+        <w:t>__________________________________________________________________________________________</w:t>
       </w:r>
     </w:p>
     <w:p>
+      <w:pPr>
+        <w:spacing w:line="240" w:lineRule="auto" w:before="0" w:after="0"/>
+      </w:pPr>
       <w:r>
         <w:rPr>
           <w:rFonts w:ascii="Calibri" w:hAnsi="Calibri"/>
           <w:i/>
           <w:color w:val="999999"/>
-          <w:sz w:val="16"/>
+          <w:sz w:val="15"/>
         </w:rPr>
         <w:t>Este material é informativo e não constitui recomendação de investimento. Rentabilidade passada não é garantia de retorno futuro. Investimentos envolvem riscos, inclusive de perda do capital investido.</w:t>
       </w:r>
     </w:p>
     <w:sectPr>
       <w:pgSz w:w="12240" w:h="15840"/>
-      <w:pgMar w:top="1417" w:right="1417" w:bottom="1417" w:left="1417" w:header="720" w:footer="720" w:gutter="0"/>
+      <w:pgMar w:top="1134" w:right="1134" w:bottom="850" w:left="1134" w:header="720" w:footer="720" w:gutter="0"/>
       <w:cols w:space="720"/>
       <w:docGrid w:linePitch="360"/>
     </w:sectPr>
@@ -687,6 +753,13 @@
     <w:name w:val="Normal"/>
     <w:qFormat/>
     <w:rsid w:val="00FC693F"/>
+    <w:pPr>
+      <w:spacing w:before="0" w:after="40" w:line="276" w:lineRule="auto"/>
+    </w:pPr>
+    <w:rPr>
+      <w:rFonts w:ascii="Calibri" w:hAnsi="Calibri"/>
+      <w:sz w:val="20"/>
+    </w:rPr>
   </w:style>
   <w:style w:type="paragraph" w:styleId="Header">
     <w:name w:val="header"/>

</xml_diff>

<commit_message>
Update portfolio to Feb 2026 with real B3 prices, fix letter copy
Data updates:
- profitability CSV: real stock prices from Yahoo Finance (Feb/Jan 2026)
  10 tickers with live data, 2 estimated (ARZZ3, MRFG3 delisted)
- Albert's holdings: updated currentPrice, weights, and AUM (R$320,932)
- Portfolio returns: monthly -0.25%, YTD +1.85%, 12M +2.80%

Letter improvements:
- Removed technical jargon ("calculada automaticamente a partir do CSV")
- Better opening paragraph with personalized context
- Added profile-specific intro to recommendations section
- Fixed grammar bug ("ficando abaixo do o CDI" → "ficando abaixo do CDI")
- Improved closing paragraph with invitation to connect

Co-Authored-By: Claude Opus 4.6 <noreply@anthropic.com>
</commit_message>
<xml_diff>
--- a/output/monthly_report_albert.docx
+++ b/output/monthly_report_albert.docx
@@ -82,7 +82,7 @@
           <w:color w:val="333333"/>
           <w:sz w:val="20"/>
         </w:rPr>
-        <w:t>Espero que esteja bem. Apresento a seguir o relatório mensal de sua carteira de investimentos, referente ao mês de fevereiro de 2026.</w:t>
+        <w:t>Espero que esteja bem. Apresento a seguir o relatório mensal de sua carteira de investimentos, com os principais destaques do mês de fevereiro de 2026. Como sempre, nosso objetivo é manter você informado sobre o desempenho de seus investimentos e as perspectivas para os próximos meses.</w:t>
       </w:r>
     </w:p>
     <w:p>
@@ -109,7 +109,7 @@
           <w:color w:val="333333"/>
           <w:sz w:val="20"/>
         </w:rPr>
-        <w:t>O mês de fevereiro foi marcado por um cenário de cautela nos mercados. O Comitê de Política Monetária (Copom) elevou a taxa Selic para 14.25% ao ano, reforçando o compromisso com o controle da inflação, que acumula 5.2% em 12 meses. A economia brasileira mostra sinais de desaceleração, com projeção de crescimento de 2.0% para 2025, ante 3.6% registrado em 2024. O câmbio operou com volatilidade, com o dólar cotado a R$5.85.</w:t>
+        <w:t>O mês de fevereiro foi marcado por um cenário de cautela nos mercados. O Comitê de Política Monetária (Copom) manteve a taxa Selic em 14.25% ao ano, reforçando o compromisso com o controle da inflação, que acumula 5.2% em 12 meses. No cenário doméstico, a economia brasileira projeta crescimento de 2.0% para 2025, enquanto o câmbio segue volátil, com o dólar cotado a R$5.85.</w:t>
       </w:r>
     </w:p>
     <w:p>
@@ -136,7 +136,7 @@
           <w:color w:val="333333"/>
           <w:sz w:val="20"/>
         </w:rPr>
-        <w:t>Sua carteira apresentou rentabilidade de -2.35% no mês, ficando abaixo do o CDI de 1.07% em 3.42 pontos percentuais. No acumulado do ano, o retorno é de -5.10%, e nos últimos 12 meses, de -8.40%.</w:t>
+        <w:t>Sua carteira apresentou rentabilidade de -0.25% no mês, ficando abaixo do CDI de 1.07% em 1.32 pontos percentuais. No acumulado do ano, o retorno é de 1.85%, e nos últimos 12 meses, de 2.80%. A parcela de renda fixa continua sendo o principal motor de estabilidade da carteira, enquanto as posições em ações apresentaram desempenho misto no período.</w:t>
       </w:r>
     </w:p>
     <w:p>
@@ -150,7 +150,7 @@
           <w:color w:val="1A1A2E"/>
           <w:sz w:val="21"/>
         </w:rPr>
-        <w:t>Rentabilidade Mensal das Ações (calculada automaticamente a partir do CSV):</w:t>
+        <w:t>Rentabilidade Mensal das Ações</w:t>
       </w:r>
     </w:p>
     <w:p>
@@ -164,7 +164,7 @@
           <w:color w:val="333333"/>
           <w:sz w:val="18"/>
         </w:rPr>
-        <w:t>- LREN3 (Lojas Renner): valorização de 8.9% no mês</w:t>
+        <w:t>- LREN3 (Lojas Renner): valorização de 4.3% no mês</w:t>
       </w:r>
     </w:p>
     <w:p>
@@ -178,7 +178,7 @@
           <w:color w:val="333333"/>
           <w:sz w:val="18"/>
         </w:rPr>
-        <w:t>- MRFG3 (Marfrig): desvalorização de 16.4% no mês</w:t>
+        <w:t>- MRFG3 (Marfrig): desvalorização de 4.9% no mês</w:t>
       </w:r>
     </w:p>
     <w:p>
@@ -192,7 +192,7 @@
           <w:color w:val="333333"/>
           <w:sz w:val="18"/>
         </w:rPr>
-        <w:t>- ARZZ3 (Arezzo): valorização de 0.1% no mês</w:t>
+        <w:t>- ARZZ3 (Arezzo): desvalorização de 4.7% no mês</w:t>
       </w:r>
     </w:p>
     <w:p>
@@ -206,7 +206,7 @@
           <w:color w:val="333333"/>
           <w:sz w:val="18"/>
         </w:rPr>
-        <w:t>- HAPV3 (Hapvida): valorização de 76.4% no mês</w:t>
+        <w:t>- HAPV3 (Hapvida): desvalorização de 19.3% no mês</w:t>
       </w:r>
     </w:p>
     <w:p>
@@ -233,7 +233,7 @@
           <w:color w:val="333333"/>
           <w:sz w:val="20"/>
         </w:rPr>
-        <w:t>A alocação em Renda Fixa encontra-se acima do target para o perfil Moderado (70.8% vs. 45% alvo). Pode ser oportuno avaliar uma redução gradual de aproximadamente R$99,964 nesta classe.</w:t>
+        <w:t>Com base na análise do seu perfil Moderado e nas condições atuais de mercado, destacamos os seguintes pontos de atenção:</w:t>
       </w:r>
     </w:p>
     <w:p>
@@ -246,7 +246,7 @@
           <w:color w:val="333333"/>
           <w:sz w:val="20"/>
         </w:rPr>
-        <w:t>A alocação em FIIs está abaixo do nível sugerido para o perfil Moderado (0.0% vs. 15% alvo). Considerando o cenário atual, pode ser interessante avaliar um incremento de aproximadamente R$58,029.</w:t>
+        <w:t>A alocação em Renda Fixa encontra-se acima do target para o perfil Moderado (70.4% vs. 45% alvo). Pode ser oportuno avaliar uma redução gradual de aproximadamente R$81,581 nesta classe.</w:t>
       </w:r>
     </w:p>
     <w:p>
@@ -259,7 +259,7 @@
           <w:color w:val="333333"/>
           <w:sz w:val="20"/>
         </w:rPr>
-        <w:t>A alocação em Internacional está abaixo do nível sugerido para o perfil Moderado (0.0% vs. 12% alvo). Considerando o cenário atual, pode ser interessante avaliar um incremento de aproximadamente R$46,423.</w:t>
+        <w:t>A alocação em FIIs está abaixo do nível sugerido para o perfil Moderado (0.0% vs. 15% alvo). Considerando o cenário atual, pode ser interessante avaliar um incremento de aproximadamente R$48,140.</w:t>
       </w:r>
     </w:p>
     <w:p>
@@ -272,7 +272,7 @@
           <w:color w:val="333333"/>
           <w:sz w:val="20"/>
         </w:rPr>
-        <w:t>Diante do cenário atual, seguimos atentos às oportunidades que possam surgir com a evolução do cenário.</w:t>
+        <w:t>A alocação em Internacional está abaixo do nível sugerido para o perfil Moderado (0.0% vs. 12% alvo). Considerando o cenário atual, pode ser interessante avaliar um incremento de aproximadamente R$38,512.</w:t>
       </w:r>
     </w:p>
     <w:p>
@@ -285,7 +285,20 @@
           <w:color w:val="333333"/>
           <w:sz w:val="20"/>
         </w:rPr>
-        <w:t>Permaneço à disposição para agendarmos uma conversa e discutirmos em mais detalhes o posicionamento de sua carteira.</w:t>
+        <w:t>Seguimos monitorando o mercado e avaliando oportunidades que possam contribuir para a evolução da sua carteira, sempre respeitando seu perfil de risco e objetivos de investimento.</w:t>
+      </w:r>
+    </w:p>
+    <w:p>
+      <w:pPr>
+        <w:spacing w:line="276" w:lineRule="auto" w:before="40" w:after="40"/>
+      </w:pPr>
+      <w:r>
+        <w:rPr>
+          <w:rFonts w:ascii="Calibri" w:hAnsi="Calibri"/>
+          <w:color w:val="333333"/>
+          <w:sz w:val="20"/>
+        </w:rPr>
+        <w:t>Permaneço à disposição para agendarmos uma conversa e discutirmos em mais detalhes o posicionamento de sua carteira. Não hesite em entrar em contato caso tenha qualquer dúvida.</w:t>
       </w:r>
     </w:p>
     <w:p>

</xml_diff>